<commit_message>
Update daily snapshot and digest outputs
</commit_message>
<xml_diff>
--- a/Space_News_02_08_2026.docx
+++ b/Space_News_02_08_2026.docx
@@ -181,7 +181,7 @@
       <w:r>
         <w:drawing>
           <wp:inline xmlns:a="http://schemas.openxmlformats.org/drawingml/2006/main" xmlns:pic="http://schemas.openxmlformats.org/drawingml/2006/picture">
-            <wp:extent cx="4389120" cy="4389120"/>
+            <wp:extent cx="4389120" cy="2644726"/>
             <wp:docPr id="3" name="Picture 3"/>
             <wp:cNvGraphicFramePr>
               <a:graphicFrameLocks noChangeAspect="1"/>
@@ -202,7 +202,7 @@
                   <pic:spPr>
                     <a:xfrm>
                       <a:off x="0" y="0"/>
-                      <a:ext cx="4389120" cy="4389120"/>
+                      <a:ext cx="4389120" cy="2644726"/>
                     </a:xfrm>
                     <a:prstGeom prst="rect"/>
                   </pic:spPr>
@@ -362,6 +362,46 @@
     </w:p>
     <w:p>
       <w:pPr>
+        <w:spacing w:after="120"/>
+        <w:jc w:val="center"/>
+      </w:pPr>
+      <w:r>
+        <w:drawing>
+          <wp:inline xmlns:a="http://schemas.openxmlformats.org/drawingml/2006/main" xmlns:pic="http://schemas.openxmlformats.org/drawingml/2006/picture">
+            <wp:extent cx="4389120" cy="2157984"/>
+            <wp:docPr id="4" name="Picture 4"/>
+            <wp:cNvGraphicFramePr>
+              <a:graphicFrameLocks noChangeAspect="1"/>
+            </wp:cNvGraphicFramePr>
+            <a:graphic>
+              <a:graphicData uri="http://schemas.openxmlformats.org/drawingml/2006/picture">
+                <pic:pic>
+                  <pic:nvPicPr>
+                    <pic:cNvPr id="0" name="image.png"/>
+                    <pic:cNvPicPr/>
+                  </pic:nvPicPr>
+                  <pic:blipFill>
+                    <a:blip r:embed="rId17"/>
+                    <a:stretch>
+                      <a:fillRect/>
+                    </a:stretch>
+                  </pic:blipFill>
+                  <pic:spPr>
+                    <a:xfrm>
+                      <a:off x="0" y="0"/>
+                      <a:ext cx="4389120" cy="2157984"/>
+                    </a:xfrm>
+                    <a:prstGeom prst="rect"/>
+                  </pic:spPr>
+                </pic:pic>
+              </a:graphicData>
+            </a:graphic>
+          </wp:inline>
+        </w:drawing>
+      </w:r>
+    </w:p>
+    <w:p>
+      <w:pPr>
         <w:spacing w:after="120" w:line="276" w:lineRule="auto"/>
         <w:jc w:val="both"/>
       </w:pPr>
@@ -399,7 +439,7 @@
         <w:spacing w:after="80"/>
         <w:jc w:val="left"/>
       </w:pPr>
-      <w:hyperlink r:id="rId17">
+      <w:hyperlink r:id="rId18">
         <w:r>
           <w:rPr>
             <w:color w:val="0000FF"/>
@@ -418,7 +458,7 @@
         <w:drawing>
           <wp:inline xmlns:a="http://schemas.openxmlformats.org/drawingml/2006/main" xmlns:pic="http://schemas.openxmlformats.org/drawingml/2006/picture">
             <wp:extent cx="4389120" cy="4389120"/>
-            <wp:docPr id="4" name="Picture 4"/>
+            <wp:docPr id="5" name="Picture 5"/>
             <wp:cNvGraphicFramePr>
               <a:graphicFrameLocks noChangeAspect="1"/>
             </wp:cNvGraphicFramePr>
@@ -430,7 +470,7 @@
                     <pic:cNvPicPr/>
                   </pic:nvPicPr>
                   <pic:blipFill>
-                    <a:blip r:embed="rId18"/>
+                    <a:blip r:embed="rId19"/>
                     <a:stretch>
                       <a:fillRect/>
                     </a:stretch>
@@ -488,7 +528,7 @@
         <w:spacing w:after="80"/>
         <w:jc w:val="left"/>
       </w:pPr>
-      <w:hyperlink r:id="rId19">
+      <w:hyperlink r:id="rId20">
         <w:r>
           <w:rPr>
             <w:color w:val="0000FF"/>
@@ -507,7 +547,7 @@
         <w:drawing>
           <wp:inline xmlns:a="http://schemas.openxmlformats.org/drawingml/2006/main" xmlns:pic="http://schemas.openxmlformats.org/drawingml/2006/picture">
             <wp:extent cx="4389120" cy="2468880"/>
-            <wp:docPr id="5" name="Picture 5"/>
+            <wp:docPr id="6" name="Picture 6"/>
             <wp:cNvGraphicFramePr>
               <a:graphicFrameLocks noChangeAspect="1"/>
             </wp:cNvGraphicFramePr>
@@ -519,7 +559,7 @@
                     <pic:cNvPicPr/>
                   </pic:nvPicPr>
                   <pic:blipFill>
-                    <a:blip r:embed="rId20"/>
+                    <a:blip r:embed="rId21"/>
                     <a:stretch>
                       <a:fillRect/>
                     </a:stretch>
@@ -577,7 +617,7 @@
         <w:spacing w:after="80"/>
         <w:jc w:val="left"/>
       </w:pPr>
-      <w:hyperlink r:id="rId21">
+      <w:hyperlink r:id="rId22">
         <w:r>
           <w:rPr>
             <w:color w:val="0000FF"/>
@@ -596,7 +636,7 @@
         <w:drawing>
           <wp:inline xmlns:a="http://schemas.openxmlformats.org/drawingml/2006/main" xmlns:pic="http://schemas.openxmlformats.org/drawingml/2006/picture">
             <wp:extent cx="4389120" cy="2470175"/>
-            <wp:docPr id="6" name="Picture 6"/>
+            <wp:docPr id="7" name="Picture 7"/>
             <wp:cNvGraphicFramePr>
               <a:graphicFrameLocks noChangeAspect="1"/>
             </wp:cNvGraphicFramePr>
@@ -608,7 +648,7 @@
                     <pic:cNvPicPr/>
                   </pic:nvPicPr>
                   <pic:blipFill>
-                    <a:blip r:embed="rId22"/>
+                    <a:blip r:embed="rId23"/>
                     <a:stretch>
                       <a:fillRect/>
                     </a:stretch>
@@ -666,7 +706,7 @@
         <w:spacing w:after="80"/>
         <w:jc w:val="left"/>
       </w:pPr>
-      <w:hyperlink r:id="rId23">
+      <w:hyperlink r:id="rId24">
         <w:r>
           <w:rPr>
             <w:color w:val="0000FF"/>
@@ -685,7 +725,7 @@
         <w:drawing>
           <wp:inline xmlns:a="http://schemas.openxmlformats.org/drawingml/2006/main" xmlns:pic="http://schemas.openxmlformats.org/drawingml/2006/picture">
             <wp:extent cx="4389120" cy="2468880"/>
-            <wp:docPr id="7" name="Picture 7"/>
+            <wp:docPr id="8" name="Picture 8"/>
             <wp:cNvGraphicFramePr>
               <a:graphicFrameLocks noChangeAspect="1"/>
             </wp:cNvGraphicFramePr>
@@ -697,7 +737,7 @@
                     <pic:cNvPicPr/>
                   </pic:nvPicPr>
                   <pic:blipFill>
-                    <a:blip r:embed="rId24"/>
+                    <a:blip r:embed="rId25"/>
                     <a:stretch>
                       <a:fillRect/>
                     </a:stretch>
@@ -755,7 +795,7 @@
         <w:spacing w:after="80"/>
         <w:jc w:val="left"/>
       </w:pPr>
-      <w:hyperlink r:id="rId25">
+      <w:hyperlink r:id="rId26">
         <w:r>
           <w:rPr>
             <w:color w:val="0000FF"/>
@@ -764,6 +804,46 @@
           <w:t>Read more</w:t>
         </w:r>
       </w:hyperlink>
+    </w:p>
+    <w:p>
+      <w:pPr>
+        <w:spacing w:after="120"/>
+        <w:jc w:val="center"/>
+      </w:pPr>
+      <w:r>
+        <w:drawing>
+          <wp:inline xmlns:a="http://schemas.openxmlformats.org/drawingml/2006/main" xmlns:pic="http://schemas.openxmlformats.org/drawingml/2006/picture">
+            <wp:extent cx="4389120" cy="2470912"/>
+            <wp:docPr id="9" name="Picture 9"/>
+            <wp:cNvGraphicFramePr>
+              <a:graphicFrameLocks noChangeAspect="1"/>
+            </wp:cNvGraphicFramePr>
+            <a:graphic>
+              <a:graphicData uri="http://schemas.openxmlformats.org/drawingml/2006/picture">
+                <pic:pic>
+                  <pic:nvPicPr>
+                    <pic:cNvPr id="0" name="image.png"/>
+                    <pic:cNvPicPr/>
+                  </pic:nvPicPr>
+                  <pic:blipFill>
+                    <a:blip r:embed="rId27"/>
+                    <a:stretch>
+                      <a:fillRect/>
+                    </a:stretch>
+                  </pic:blipFill>
+                  <pic:spPr>
+                    <a:xfrm>
+                      <a:off x="0" y="0"/>
+                      <a:ext cx="4389120" cy="2470912"/>
+                    </a:xfrm>
+                    <a:prstGeom prst="rect"/>
+                  </pic:spPr>
+                </pic:pic>
+              </a:graphicData>
+            </a:graphic>
+          </wp:inline>
+        </w:drawing>
+      </w:r>
     </w:p>
     <w:p>
       <w:pPr>

</xml_diff>